<commit_message>
docs: correct deployment layout - regions can host all environments, distribution is deployment choice
</commit_message>
<xml_diff>
--- a/Reference-Material/reference/acrme_cr_crg_deployment_layout.docx
+++ b/Reference-Material/reference/acrme_cr_crg_deployment_layout.docx
@@ -1090,20 +1090,57 @@
         <w:t xml:space="preserve"> </w:t>
       </w:r>
       <w:r>
-        <w:t xml:space="preserve">Prod, CVAL, and DR each in a</w:t>
-      </w:r>
-      <w:r>
-        <w:t xml:space="preserve"> </w:t>
-      </w:r>
-      <w:r>
-        <w:rPr>
-          <w:bCs/>
-          <w:b/>
-        </w:rPr>
-        <w:t xml:space="preserve">distinct region</w:t>
-      </w:r>
-      <w:r>
-        <w:t xml:space="preserve">.</w:t>
+        <w:t xml:space="preserve">For a US geography deployment,</w:t>
+      </w:r>
+      <w:r>
+        <w:t xml:space="preserve"> </w:t>
+      </w:r>
+      <w:r>
+        <w:rPr>
+          <w:bCs/>
+          <w:b/>
+        </w:rPr>
+        <w:t xml:space="preserve">select 3 distinct regions</w:t>
+      </w:r>
+      <w:r>
+        <w:t xml:space="preserve"> </w:t>
+      </w:r>
+      <w:r>
+        <w:t xml:space="preserve">and</w:t>
+      </w:r>
+      <w:r>
+        <w:t xml:space="preserve"> </w:t>
+      </w:r>
+      <w:r>
+        <w:rPr>
+          <w:bCs/>
+          <w:b/>
+        </w:rPr>
+        <w:t xml:space="preserve">distribute</w:t>
+      </w:r>
+      <w:r>
+        <w:t xml:space="preserve"> </w:t>
+      </w:r>
+      <w:r>
+        <w:t xml:space="preserve">Prod, CVAL, and DR across them. Each region can host any/all environments; the</w:t>
+      </w:r>
+      <w:r>
+        <w:t xml:space="preserve"> </w:t>
+      </w:r>
+      <w:r>
+        <w:t xml:space="preserve">“</w:t>
+      </w:r>
+      <w:r>
+        <w:t xml:space="preserve">3-region model</w:t>
+      </w:r>
+      <w:r>
+        <w:t xml:space="preserve">”</w:t>
+      </w:r>
+      <w:r>
+        <w:t xml:space="preserve"> </w:t>
+      </w:r>
+      <w:r>
+        <w:t xml:space="preserve">describes the deployment distribution strategy, not inherent region capabilities.</w:t>
       </w:r>
     </w:p>
     <w:p>
@@ -1151,7 +1188,7 @@
           <w:bCs/>
           <w:b/>
         </w:rPr>
-        <w:t xml:space="preserve">Example placement:</w:t>
+        <w:t xml:space="preserve">Example deployment distribution:</w:t>
       </w:r>
       <w:r>
         <w:t xml:space="preserve"> </w:t>
@@ -1167,7 +1204,7 @@
           <w:bCs/>
           <w:b/>
         </w:rPr>
-        <w:t xml:space="preserve">Prod:</w:t>
+        <w:t xml:space="preserve">Prod → placed in:</w:t>
       </w:r>
       <w:r>
         <w:t xml:space="preserve"> </w:t>
@@ -1189,7 +1226,7 @@
           <w:bCs/>
           <w:b/>
         </w:rPr>
-        <w:t xml:space="preserve">CVAL:</w:t>
+        <w:t xml:space="preserve">CVAL → placed in:</w:t>
       </w:r>
       <w:r>
         <w:t xml:space="preserve"> </w:t>
@@ -1211,13 +1248,47 @@
           <w:bCs/>
           <w:b/>
         </w:rPr>
-        <w:t xml:space="preserve">DR:</w:t>
+        <w:t xml:space="preserve">DR → placed in:</w:t>
       </w:r>
       <w:r>
         <w:t xml:space="preserve"> </w:t>
       </w:r>
       <w:r>
         <w:t xml:space="preserve">Canada Central</w:t>
+      </w:r>
+    </w:p>
+    <w:p>
+      <w:pPr>
+        <w:pStyle w:val="BlockText"/>
+      </w:pPr>
+      <w:r>
+        <w:rPr>
+          <w:bCs/>
+          <w:b/>
+        </w:rPr>
+        <w:t xml:space="preserve">Note:</w:t>
+      </w:r>
+      <w:r>
+        <w:t xml:space="preserve"> </w:t>
+      </w:r>
+      <w:r>
+        <w:t xml:space="preserve">Any of these regions can technically host all three environments simultaneously (each with separate subscriptions/RGs/CRGs per ENV-003). The distribution above shows a</w:t>
+      </w:r>
+      <w:r>
+        <w:t xml:space="preserve"> </w:t>
+      </w:r>
+      <w:r>
+        <w:rPr>
+          <w:bCs/>
+          <w:b/>
+        </w:rPr>
+        <w:t xml:space="preserve">deployment choice</w:t>
+      </w:r>
+      <w:r>
+        <w:t xml:space="preserve"> </w:t>
+      </w:r>
+      <w:r>
+        <w:t xml:space="preserve">for one customer, not a region capability limit.</w:t>
       </w:r>
     </w:p>
     <w:bookmarkStart w:id="26" w:name="production-environment-west-us-3-3-zones"/>
@@ -2073,23 +2144,39 @@
         <w:t xml:space="preserve"> </w:t>
       </w:r>
       <w:r>
-        <w:t xml:space="preserve">Prod in one region;</w:t>
-      </w:r>
-      <w:r>
-        <w:t xml:space="preserve"> </w:t>
-      </w:r>
-      <w:r>
-        <w:rPr>
-          <w:bCs/>
-          <w:b/>
-        </w:rPr>
-        <w:t xml:space="preserve">CVAL + DR co-located</w:t>
-      </w:r>
-      <w:r>
-        <w:t xml:space="preserve"> </w:t>
-      </w:r>
-      <w:r>
-        <w:t xml:space="preserve">in the other.</w:t>
+        <w:t xml:space="preserve">For a Europe geography deployment,</w:t>
+      </w:r>
+      <w:r>
+        <w:t xml:space="preserve"> </w:t>
+      </w:r>
+      <w:r>
+        <w:rPr>
+          <w:bCs/>
+          <w:b/>
+        </w:rPr>
+        <w:t xml:space="preserve">select 2 regions</w:t>
+      </w:r>
+      <w:r>
+        <w:t xml:space="preserve"> </w:t>
+      </w:r>
+      <w:r>
+        <w:t xml:space="preserve">and</w:t>
+      </w:r>
+      <w:r>
+        <w:t xml:space="preserve"> </w:t>
+      </w:r>
+      <w:r>
+        <w:rPr>
+          <w:bCs/>
+          <w:b/>
+        </w:rPr>
+        <w:t xml:space="preserve">distribute</w:t>
+      </w:r>
+      <w:r>
+        <w:t xml:space="preserve"> </w:t>
+      </w:r>
+      <w:r>
+        <w:t xml:space="preserve">environments: Prod in one region, CVAL + DR co-located in the other. Each region can host any/all environments; co-location is the deployment strategy for 2-region geographies.</w:t>
       </w:r>
     </w:p>
     <w:p>
@@ -2137,7 +2224,7 @@
           <w:bCs/>
           <w:b/>
         </w:rPr>
-        <w:t xml:space="preserve">Example placement:</w:t>
+        <w:t xml:space="preserve">Example deployment distribution:</w:t>
       </w:r>
       <w:r>
         <w:t xml:space="preserve"> </w:t>
@@ -2153,7 +2240,7 @@
           <w:bCs/>
           <w:b/>
         </w:rPr>
-        <w:t xml:space="preserve">Prod:</w:t>
+        <w:t xml:space="preserve">Prod → placed in:</w:t>
       </w:r>
       <w:r>
         <w:t xml:space="preserve"> </w:t>
@@ -2175,13 +2262,31 @@
           <w:bCs/>
           <w:b/>
         </w:rPr>
-        <w:t xml:space="preserve">CVAL + DR co-located:</w:t>
+        <w:t xml:space="preserve">CVAL + DR → co-located in:</w:t>
       </w:r>
       <w:r>
         <w:t xml:space="preserve"> </w:t>
       </w:r>
       <w:r>
         <w:t xml:space="preserve">Switzerland North</w:t>
+      </w:r>
+    </w:p>
+    <w:p>
+      <w:pPr>
+        <w:pStyle w:val="BlockText"/>
+      </w:pPr>
+      <w:r>
+        <w:rPr>
+          <w:bCs/>
+          <w:b/>
+        </w:rPr>
+        <w:t xml:space="preserve">Note:</w:t>
+      </w:r>
+      <w:r>
+        <w:t xml:space="preserve"> </w:t>
+      </w:r>
+      <w:r>
+        <w:t xml:space="preserve">Either region can technically host all three environments. The co-location pattern is required by PLC-010a for 2-region geographies (Prod isolation maintained; CVAL+DR share the second region to satisfy ENV-003 while delivering in-geo DR).</w:t>
       </w:r>
     </w:p>
     <w:bookmarkStart w:id="30" w:name="X81f0e10e7c076a00b2a718b45c6343e316d2302"/>
@@ -2933,7 +3038,7 @@
           <w:bCs/>
           <w:b/>
         </w:rPr>
-        <w:t xml:space="preserve">Example placement:</w:t>
+        <w:t xml:space="preserve">Example deployment distribution:</w:t>
       </w:r>
       <w:r>
         <w:t xml:space="preserve"> </w:t>
@@ -2949,7 +3054,7 @@
           <w:bCs/>
           <w:b/>
         </w:rPr>
-        <w:t xml:space="preserve">Prod:</w:t>
+        <w:t xml:space="preserve">Prod → placed in:</w:t>
       </w:r>
       <w:r>
         <w:t xml:space="preserve"> </w:t>
@@ -2971,7 +3076,7 @@
           <w:bCs/>
           <w:b/>
         </w:rPr>
-        <w:t xml:space="preserve">CVAL + DR co-located:</w:t>
+        <w:t xml:space="preserve">CVAL + DR → co-located in:</w:t>
       </w:r>
       <w:r>
         <w:t xml:space="preserve"> </w:t>
@@ -2982,7 +3087,25 @@
     </w:p>
     <w:p>
       <w:pPr>
-        <w:pStyle w:val="BodyText"/>
+        <w:pStyle w:val="BlockText"/>
+      </w:pPr>
+      <w:r>
+        <w:rPr>
+          <w:bCs/>
+          <w:b/>
+        </w:rPr>
+        <w:t xml:space="preserve">Note:</w:t>
+      </w:r>
+      <w:r>
+        <w:t xml:space="preserve"> </w:t>
+      </w:r>
+      <w:r>
+        <w:t xml:space="preserve">Either region can host all three environments. Distribution follows the same 2-region co-location pattern as Europe.</w:t>
+      </w:r>
+    </w:p>
+    <w:p>
+      <w:pPr>
+        <w:pStyle w:val="FirstParagraph"/>
       </w:pPr>
       <w:r>
         <w:rPr>
@@ -3064,7 +3187,7 @@
           <w:bCs/>
           <w:b/>
         </w:rPr>
-        <w:t xml:space="preserve">Example placement (current 2-region):</w:t>
+        <w:t xml:space="preserve">Example deployment distribution (current 2-region):</w:t>
       </w:r>
       <w:r>
         <w:t xml:space="preserve"> </w:t>
@@ -3080,7 +3203,7 @@
           <w:bCs/>
           <w:b/>
         </w:rPr>
-        <w:t xml:space="preserve">Prod:</w:t>
+        <w:t xml:space="preserve">Prod → placed in:</w:t>
       </w:r>
       <w:r>
         <w:t xml:space="preserve"> </w:t>
@@ -3102,7 +3225,7 @@
           <w:bCs/>
           <w:b/>
         </w:rPr>
-        <w:t xml:space="preserve">CVAL + DR co-located:</w:t>
+        <w:t xml:space="preserve">CVAL + DR → co-located in:</w:t>
       </w:r>
       <w:r>
         <w:t xml:space="preserve"> </w:t>
@@ -3113,7 +3236,25 @@
     </w:p>
     <w:p>
       <w:pPr>
-        <w:pStyle w:val="BodyText"/>
+        <w:pStyle w:val="BlockText"/>
+      </w:pPr>
+      <w:r>
+        <w:rPr>
+          <w:bCs/>
+          <w:b/>
+        </w:rPr>
+        <w:t xml:space="preserve">Note:</w:t>
+      </w:r>
+      <w:r>
+        <w:t xml:space="preserve"> </w:t>
+      </w:r>
+      <w:r>
+        <w:t xml:space="preserve">Either region can host all three environments. Distribution follows the same 2-region co-location pattern as Europe.</w:t>
+      </w:r>
+    </w:p>
+    <w:p>
+      <w:pPr>
+        <w:pStyle w:val="FirstParagraph"/>
       </w:pPr>
       <w:r>
         <w:rPr>
@@ -3229,7 +3370,7 @@
           <w:bCs/>
           <w:b/>
         </w:rPr>
-        <w:t xml:space="preserve">Example placement:</w:t>
+        <w:t xml:space="preserve">Example deployment distribution:</w:t>
       </w:r>
       <w:r>
         <w:t xml:space="preserve"> </w:t>
@@ -3245,7 +3386,7 @@
           <w:bCs/>
           <w:b/>
         </w:rPr>
-        <w:t xml:space="preserve">Prod:</w:t>
+        <w:t xml:space="preserve">Prod → placed in:</w:t>
       </w:r>
       <w:r>
         <w:t xml:space="preserve"> </w:t>
@@ -3267,7 +3408,7 @@
           <w:bCs/>
           <w:b/>
         </w:rPr>
-        <w:t xml:space="preserve">CVAL:</w:t>
+        <w:t xml:space="preserve">CVAL → placed in:</w:t>
       </w:r>
       <w:r>
         <w:t xml:space="preserve"> </w:t>
@@ -3323,6 +3464,40 @@
       </w:r>
       <w:r>
         <w:t xml:space="preserve">flag set)</w:t>
+      </w:r>
+    </w:p>
+    <w:p>
+      <w:pPr>
+        <w:pStyle w:val="BlockText"/>
+      </w:pPr>
+      <w:r>
+        <w:rPr>
+          <w:bCs/>
+          <w:b/>
+        </w:rPr>
+        <w:t xml:space="preserve">Note:</w:t>
+      </w:r>
+      <w:r>
+        <w:t xml:space="preserve"> </w:t>
+      </w:r>
+      <w:r>
+        <w:t xml:space="preserve">Both regions can technically host Prod and CVAL. DR environment CRGs are</w:t>
+      </w:r>
+      <w:r>
+        <w:t xml:space="preserve"> </w:t>
+      </w:r>
+      <w:r>
+        <w:rPr>
+          <w:bCs/>
+          <w:b/>
+        </w:rPr>
+        <w:t xml:space="preserve">not built</w:t>
+      </w:r>
+      <w:r>
+        <w:t xml:space="preserve"> </w:t>
+      </w:r>
+      <w:r>
+        <w:t xml:space="preserve">for Middle East due to legal constraints (DEC-001), unlike other 2-region geographies where DR is offered via co-location.</w:t>
       </w:r>
     </w:p>
     <w:p>

</xml_diff>

<commit_message>
docs: add CVAL/DR shared-reservation model (2 CRG groupings/region, steady-state<->DR consumer swap) + diagram_9 ref
</commit_message>
<xml_diff>
--- a/Reference-Material/reference/acrme_cr_crg_deployment_layout.docx
+++ b/Reference-Material/reference/acrme_cr_crg_deployment_layout.docx
@@ -2,7 +2,7 @@
 <file path=word/document.xml><?xml version="1.0" encoding="utf-8"?>
 <w:document xmlns:w="http://schemas.openxmlformats.org/wordprocessingml/2006/main" xmlns:m="http://schemas.openxmlformats.org/officeDocument/2006/math" xmlns:r="http://schemas.openxmlformats.org/officeDocument/2006/relationships" xmlns:o="urn:schemas-microsoft-com:office:office" xmlns:v="urn:schemas-microsoft-com:vml" xmlns:w10="urn:schemas-microsoft-com:office:word" xmlns:a="http://schemas.openxmlformats.org/drawingml/2006/main" xmlns:pic="http://schemas.openxmlformats.org/drawingml/2006/picture" xmlns:wp="http://schemas.openxmlformats.org/drawingml/2006/wordprocessingDrawing">
   <w:body>
-    <w:bookmarkStart w:id="51" w:name="acrme-cr-crg-deployment-layout-reference"/>
+    <w:bookmarkStart w:id="53" w:name="acrme-cr-crg-deployment-layout-reference"/>
     <w:p>
       <w:pPr>
         <w:pStyle w:val="Heading1"/>
@@ -4631,7 +4631,7 @@
       </w:r>
     </w:p>
     <w:bookmarkEnd w:id="37"/>
-    <w:bookmarkStart w:id="40" w:name="cross-subscription-sharing-tier-123"/>
+    <w:bookmarkStart w:id="42" w:name="cross-subscription-sharing-tier-123"/>
     <w:p>
       <w:pPr>
         <w:pStyle w:val="Heading2"/>
@@ -5095,6 +5095,855 @@
       </w:r>
       <w:r>
         <w:t xml:space="preserve">- Sharing state tracked: provider, authorized consumers, consuming VMs, consumed/remaining quantities (CAP-014)</w:t>
+      </w:r>
+    </w:p>
+    <w:bookmarkEnd w:id="39"/>
+    <w:bookmarkStart w:id="41" w:name="X15fe48a58016390790f883f18f2cbc045f5fe76"/>
+    <w:p>
+      <w:pPr>
+        <w:pStyle w:val="Heading3"/>
+      </w:pPr>
+      <w:r>
+        <w:t xml:space="preserve">5.3 CVAL/DR Shared-Reservation Model — Two CRG Groupings per Region</w:t>
+      </w:r>
+    </w:p>
+    <w:p>
+      <w:pPr>
+        <w:pStyle w:val="BlockText"/>
+      </w:pPr>
+      <w:r>
+        <w:rPr>
+          <w:bCs/>
+          <w:b/>
+        </w:rPr>
+        <w:t xml:space="preserve">See diagram:</w:t>
+      </w:r>
+      <w:r>
+        <w:t xml:space="preserve"> </w:t>
+      </w:r>
+      <w:r>
+        <w:rPr>
+          <w:rStyle w:val="VerbatimChar"/>
+        </w:rPr>
+        <w:t xml:space="preserve">Architecture/diagrams/diagram_9_cval_dr_shared_reservation_model.png</w:t>
+      </w:r>
+    </w:p>
+    <w:p>
+      <w:pPr>
+        <w:pStyle w:val="FirstParagraph"/>
+      </w:pPr>
+      <w:r>
+        <w:t xml:space="preserve">Building on the provider/consumer model above, the</w:t>
+      </w:r>
+      <w:r>
+        <w:t xml:space="preserve"> </w:t>
+      </w:r>
+      <w:r>
+        <w:rPr>
+          <w:bCs/>
+          <w:b/>
+        </w:rPr>
+        <w:t xml:space="preserve">environment-grouping</w:t>
+      </w:r>
+      <w:r>
+        <w:t xml:space="preserve"> </w:t>
+      </w:r>
+      <w:r>
+        <w:t xml:space="preserve">view of a region resolves to</w:t>
+      </w:r>
+      <w:r>
+        <w:t xml:space="preserve"> </w:t>
+      </w:r>
+      <w:r>
+        <w:rPr>
+          <w:bCs/>
+          <w:b/>
+        </w:rPr>
+        <w:t xml:space="preserve">two CRG groupings</w:t>
+      </w:r>
+      <w:r>
+        <w:t xml:space="preserve"> </w:t>
+      </w:r>
+      <w:r>
+        <w:t xml:space="preserve">(justified by ENV-003):</w:t>
+      </w:r>
+    </w:p>
+    <w:tbl>
+      <w:tblPr>
+        <w:tblStyle w:val="Table"/>
+        <w:tblW w:type="pct" w:w="5000"/>
+        <w:tblLook w:firstRow="1" w:lastRow="0" w:firstColumn="0" w:lastColumn="0" w:noHBand="0" w:noVBand="0" w:val="0020"/>
+      </w:tblPr>
+      <w:tblGrid>
+        <w:gridCol w:w="2640"/>
+        <w:gridCol w:w="2640"/>
+        <w:gridCol w:w="2640"/>
+      </w:tblGrid>
+      <w:tr>
+        <w:trPr>
+          <w:tblHeader w:val="true"/>
+        </w:trPr>
+        <w:tc>
+          <w:tcPr/>
+          <w:p>
+            <w:pPr>
+              <w:pStyle w:val="Compact"/>
+              <w:jc w:val="left"/>
+            </w:pPr>
+            <w:r>
+              <w:t xml:space="preserve">CRG grouping</w:t>
+            </w:r>
+          </w:p>
+        </w:tc>
+        <w:tc>
+          <w:tcPr/>
+          <w:p>
+            <w:pPr>
+              <w:pStyle w:val="Compact"/>
+              <w:jc w:val="left"/>
+            </w:pPr>
+            <w:r>
+              <w:t xml:space="preserve">Environments</w:t>
+            </w:r>
+          </w:p>
+        </w:tc>
+        <w:tc>
+          <w:tcPr/>
+          <w:p>
+            <w:pPr>
+              <w:pStyle w:val="Compact"/>
+              <w:jc w:val="left"/>
+            </w:pPr>
+            <w:r>
+              <w:t xml:space="preserve">Sharing rule (ENV-003)</w:t>
+            </w:r>
+          </w:p>
+        </w:tc>
+      </w:tr>
+      <w:tr>
+        <w:tc>
+          <w:tcPr/>
+          <w:p>
+            <w:pPr>
+              <w:pStyle w:val="Compact"/>
+              <w:jc w:val="left"/>
+            </w:pPr>
+            <w:r>
+              <w:rPr>
+                <w:bCs/>
+                <w:b/>
+              </w:rPr>
+              <w:t xml:space="preserve">Grouping 1 — Production</w:t>
+            </w:r>
+          </w:p>
+        </w:tc>
+        <w:tc>
+          <w:tcPr/>
+          <w:p>
+            <w:pPr>
+              <w:pStyle w:val="Compact"/>
+              <w:jc w:val="left"/>
+            </w:pPr>
+            <w:r>
+              <w:t xml:space="preserve">Prod only</w:t>
+            </w:r>
+          </w:p>
+        </w:tc>
+        <w:tc>
+          <w:tcPr/>
+          <w:p>
+            <w:pPr>
+              <w:pStyle w:val="Compact"/>
+              <w:jc w:val="left"/>
+            </w:pPr>
+            <w:r>
+              <w:t xml:space="preserve">Prod</w:t>
+            </w:r>
+            <w:r>
+              <w:t xml:space="preserve"> </w:t>
+            </w:r>
+            <w:r>
+              <w:rPr>
+                <w:bCs/>
+                <w:b/>
+              </w:rPr>
+              <w:t xml:space="preserve">cannot</w:t>
+            </w:r>
+            <w:r>
+              <w:t xml:space="preserve"> </w:t>
+            </w:r>
+            <w:r>
+              <w:t xml:space="preserve">share with non-prod or DR → fully isolated</w:t>
+            </w:r>
+          </w:p>
+        </w:tc>
+      </w:tr>
+      <w:tr>
+        <w:tc>
+          <w:tcPr/>
+          <w:p>
+            <w:pPr>
+              <w:pStyle w:val="Compact"/>
+              <w:jc w:val="left"/>
+            </w:pPr>
+            <w:r>
+              <w:rPr>
+                <w:bCs/>
+                <w:b/>
+              </w:rPr>
+              <w:t xml:space="preserve">Grouping 2 — CVAL + DR</w:t>
+            </w:r>
+          </w:p>
+        </w:tc>
+        <w:tc>
+          <w:tcPr/>
+          <w:p>
+            <w:pPr>
+              <w:pStyle w:val="Compact"/>
+              <w:jc w:val="left"/>
+            </w:pPr>
+            <w:r>
+              <w:t xml:space="preserve">CVAL + DR</w:t>
+            </w:r>
+          </w:p>
+        </w:tc>
+        <w:tc>
+          <w:tcPr/>
+          <w:p>
+            <w:pPr>
+              <w:pStyle w:val="Compact"/>
+              <w:jc w:val="left"/>
+            </w:pPr>
+            <w:r>
+              <w:t xml:space="preserve">DR</w:t>
+            </w:r>
+            <w:r>
+              <w:t xml:space="preserve"> </w:t>
+            </w:r>
+            <w:r>
+              <w:rPr>
+                <w:bCs/>
+                <w:b/>
+              </w:rPr>
+              <w:t xml:space="preserve">may</w:t>
+            </w:r>
+            <w:r>
+              <w:t xml:space="preserve"> </w:t>
+            </w:r>
+            <w:r>
+              <w:t xml:space="preserve">share with non-prod → CVAL and DR share one grouping</w:t>
+            </w:r>
+          </w:p>
+        </w:tc>
+      </w:tr>
+    </w:tbl>
+    <w:p>
+      <w:pPr>
+        <w:pStyle w:val="BlockText"/>
+      </w:pPr>
+      <w:r>
+        <w:rPr>
+          <w:bCs/>
+          <w:b/>
+        </w:rPr>
+        <w:t xml:space="preserve">Reconciliation with CAP-023 (important).</w:t>
+      </w:r>
+      <w:r>
+        <w:t xml:space="preserve"> </w:t>
+      </w:r>
+      <w:r>
+        <w:t xml:space="preserve">“</w:t>
+      </w:r>
+      <w:r>
+        <w:t xml:space="preserve">Two CRG groupings per region</w:t>
+      </w:r>
+      <w:r>
+        <w:t xml:space="preserve">”</w:t>
+      </w:r>
+      <w:r>
+        <w:t xml:space="preserve"> </w:t>
+      </w:r>
+      <w:r>
+        <w:t xml:space="preserve">is the</w:t>
+      </w:r>
+      <w:r>
+        <w:t xml:space="preserve"> </w:t>
+      </w:r>
+      <w:r>
+        <w:rPr>
+          <w:bCs/>
+          <w:b/>
+        </w:rPr>
+        <w:t xml:space="preserve">environment-separation abstraction</w:t>
+      </w:r>
+      <w:r>
+        <w:t xml:space="preserve">, not a literal count of two Azure CRGs. Each grouping still expands into the</w:t>
+      </w:r>
+      <w:r>
+        <w:t xml:space="preserve"> </w:t>
+      </w:r>
+      <w:r>
+        <w:rPr>
+          <w:bCs/>
+          <w:b/>
+        </w:rPr>
+        <w:t xml:space="preserve">regional + per-AZ CRG structure</w:t>
+      </w:r>
+      <w:r>
+        <w:t xml:space="preserve"> </w:t>
+      </w:r>
+      <w:r>
+        <w:t xml:space="preserve">(1 regional + one per AZ) for structural zone isolation (CAP-011/CAP-023). So a 3-zone region yields 4 CRGs</w:t>
+      </w:r>
+      <w:r>
+        <w:t xml:space="preserve"> </w:t>
+      </w:r>
+      <w:r>
+        <w:rPr>
+          <w:iCs/>
+          <w:i/>
+        </w:rPr>
+        <w:t xml:space="preserve">per grouping</w:t>
+      </w:r>
+      <w:r>
+        <w:t xml:space="preserve"> </w:t>
+      </w:r>
+      <w:r>
+        <w:t xml:space="preserve">(8 total), while the</w:t>
+      </w:r>
+      <w:r>
+        <w:t xml:space="preserve"> </w:t>
+      </w:r>
+      <w:r>
+        <w:rPr>
+          <w:iCs/>
+          <w:i/>
+        </w:rPr>
+        <w:t xml:space="preserve">environment</w:t>
+      </w:r>
+      <w:r>
+        <w:t xml:space="preserve"> </w:t>
+      </w:r>
+      <w:r>
+        <w:t xml:space="preserve">boundary is the two groupings above.</w:t>
+      </w:r>
+    </w:p>
+    <w:bookmarkStart w:id="40" w:name="the-steady-state-dr-event-consumer-swap"/>
+    <w:p>
+      <w:pPr>
+        <w:pStyle w:val="Heading4"/>
+      </w:pPr>
+      <w:r>
+        <w:t xml:space="preserve">5.3.1 The steady-state ↔ DR-event consumer swap</w:t>
+      </w:r>
+    </w:p>
+    <w:p>
+      <w:pPr>
+        <w:pStyle w:val="FirstParagraph"/>
+      </w:pPr>
+      <w:r>
+        <w:t xml:space="preserve">The CVAL+DR grouping holds</w:t>
+      </w:r>
+      <w:r>
+        <w:t xml:space="preserve"> </w:t>
+      </w:r>
+      <w:r>
+        <w:rPr>
+          <w:bCs/>
+          <w:b/>
+        </w:rPr>
+        <w:t xml:space="preserve">one shared reservation per SKU</w:t>
+      </w:r>
+      <w:r>
+        <w:t xml:space="preserve"> </w:t>
+      </w:r>
+      <w:r>
+        <w:t xml:space="preserve">(provider-owned) whose</w:t>
+      </w:r>
+      <w:r>
+        <w:t xml:space="preserve"> </w:t>
+      </w:r>
+      <w:r>
+        <w:rPr>
+          <w:bCs/>
+          <w:b/>
+        </w:rPr>
+        <w:t xml:space="preserve">consumer subscriptions swap</w:t>
+      </w:r>
+      <w:r>
+        <w:t xml:space="preserve"> </w:t>
+      </w:r>
+      <w:r>
+        <w:t xml:space="preserve">between steady state and a declared disaster — the reservation object itself is unchanged:</w:t>
+      </w:r>
+    </w:p>
+    <w:p>
+      <w:pPr>
+        <w:pStyle w:val="BodyText"/>
+      </w:pPr>
+      <w:r>
+        <w:rPr>
+          <w:bCs/>
+          <w:b/>
+        </w:rPr>
+        <w:t xml:space="preserve">Steady state — CVAL keeps the pool warm:</w:t>
+      </w:r>
+      <w:r>
+        <w:t xml:space="preserve"> </w:t>
+      </w:r>
+      <w:r>
+        <w:t xml:space="preserve">-</w:t>
+      </w:r>
+      <w:r>
+        <w:t xml:space="preserve"> </w:t>
+      </w:r>
+      <w:r>
+        <w:rPr>
+          <w:bCs/>
+          <w:b/>
+        </w:rPr>
+        <w:t xml:space="preserve">CVAL consumer subscriptions</w:t>
+      </w:r>
+      <w:r>
+        <w:t xml:space="preserve"> </w:t>
+      </w:r>
+      <w:r>
+        <w:t xml:space="preserve">consume the shared reservation (e.g., 30 + 40 + 25 = 95 of 100 units).</w:t>
+      </w:r>
+      <w:r>
+        <w:t xml:space="preserve"> </w:t>
+      </w:r>
+      <w:r>
+        <w:t xml:space="preserve">- The reservation is</w:t>
+      </w:r>
+      <w:r>
+        <w:t xml:space="preserve"> </w:t>
+      </w:r>
+      <w:r>
+        <w:rPr>
+          <w:bCs/>
+          <w:b/>
+        </w:rPr>
+        <w:t xml:space="preserve">not idle</w:t>
+      </w:r>
+      <w:r>
+        <w:t xml:space="preserve"> </w:t>
+      </w:r>
+      <w:r>
+        <w:t xml:space="preserve">— CVAL is</w:t>
+      </w:r>
+      <w:r>
+        <w:t xml:space="preserve"> </w:t>
+      </w:r>
+      <w:r>
+        <w:t xml:space="preserve">“</w:t>
+      </w:r>
+      <w:r>
+        <w:t xml:space="preserve">free while running</w:t>
+      </w:r>
+      <w:r>
+        <w:t xml:space="preserve">”</w:t>
+      </w:r>
+      <w:r>
+        <w:t xml:space="preserve"> </w:t>
+      </w:r>
+      <w:r>
+        <w:t xml:space="preserve">(</w:t>
+      </w:r>
+      <w:r>
+        <w:rPr>
+          <w:bCs/>
+          <w:b/>
+        </w:rPr>
+        <w:t xml:space="preserve">DR-005</w:t>
+      </w:r>
+      <w:r>
+        <w:t xml:space="preserve">) and CVAL is treated as a DR capacity source (</w:t>
+      </w:r>
+      <w:r>
+        <w:rPr>
+          <w:bCs/>
+          <w:b/>
+        </w:rPr>
+        <w:t xml:space="preserve">ENV-004</w:t>
+      </w:r>
+      <w:r>
+        <w:t xml:space="preserve">).</w:t>
+      </w:r>
+      <w:r>
+        <w:t xml:space="preserve"> </w:t>
+      </w:r>
+      <w:r>
+        <w:t xml:space="preserve">- This is</w:t>
+      </w:r>
+      <w:r>
+        <w:t xml:space="preserve"> </w:t>
+      </w:r>
+      <w:r>
+        <w:rPr>
+          <w:iCs/>
+          <w:i/>
+        </w:rPr>
+        <w:t xml:space="preserve">why lean DR won</w:t>
+      </w:r>
+      <w:r>
+        <w:t xml:space="preserve">: an empty 30% DR reserve costs</w:t>
+      </w:r>
+      <w:r>
+        <w:t xml:space="preserve"> </w:t>
+      </w:r>
+      <w:r>
+        <w:rPr>
+          <w:bCs/>
+          <w:b/>
+        </w:rPr>
+        <w:t xml:space="preserve">millions/year</w:t>
+      </w:r>
+      <w:r>
+        <w:t xml:space="preserve">; keeping it warm with CVAL avoids that (</w:t>
+      </w:r>
+      <w:r>
+        <w:rPr>
+          <w:bCs/>
+          <w:b/>
+        </w:rPr>
+        <w:t xml:space="preserve">DR-003/DR-004</w:t>
+      </w:r>
+      <w:r>
+        <w:t xml:space="preserve">, cost rationale).</w:t>
+      </w:r>
+    </w:p>
+    <w:p>
+      <w:pPr>
+        <w:pStyle w:val="BodyText"/>
+      </w:pPr>
+      <w:r>
+        <w:rPr>
+          <w:bCs/>
+          <w:b/>
+        </w:rPr>
+        <w:t xml:space="preserve">DR event — DR consumers replace CVAL on the SAME reservation</w:t>
+      </w:r>
+      <w:r>
+        <w:t xml:space="preserve"> </w:t>
+      </w:r>
+      <w:r>
+        <w:t xml:space="preserve">(staged sequence,</w:t>
+      </w:r>
+      <w:r>
+        <w:t xml:space="preserve"> </w:t>
+      </w:r>
+      <w:r>
+        <w:rPr>
+          <w:bCs/>
+          <w:b/>
+        </w:rPr>
+        <w:t xml:space="preserve">DR-006</w:t>
+      </w:r>
+      <w:r>
+        <w:t xml:space="preserve">):</w:t>
+      </w:r>
+      <w:r>
+        <w:t xml:space="preserve"> </w:t>
+      </w:r>
+      <w:r>
+        <w:t xml:space="preserve">1. Shut down / disassociate eligible CVAL VMs (</w:t>
+      </w:r>
+      <w:r>
+        <w:rPr>
+          <w:bCs/>
+          <w:b/>
+        </w:rPr>
+        <w:t xml:space="preserve">DR-005/DR-006</w:t>
+      </w:r>
+      <w:r>
+        <w:t xml:space="preserve"> </w:t>
+      </w:r>
+      <w:r>
+        <w:t xml:space="preserve">step 3) → frees reserved capacity.</w:t>
+      </w:r>
+      <w:r>
+        <w:t xml:space="preserve"> </w:t>
+      </w:r>
+      <w:r>
+        <w:t xml:space="preserve">2. Reserved capacity returns to</w:t>
+      </w:r>
+      <w:r>
+        <w:t xml:space="preserve"> </w:t>
+      </w:r>
+      <w:r>
+        <w:t xml:space="preserve">“</w:t>
+      </w:r>
+      <w:r>
+        <w:t xml:space="preserve">available</w:t>
+      </w:r>
+      <w:r>
+        <w:t xml:space="preserve">”</w:t>
+      </w:r>
+      <w:r>
+        <w:t xml:space="preserve"> </w:t>
+      </w:r>
+      <w:r>
+        <w:t xml:space="preserve">within the same reservation (quantity</w:t>
+      </w:r>
+      <w:r>
+        <w:t xml:space="preserve"> </w:t>
+      </w:r>
+      <w:r>
+        <w:rPr>
+          <w:bCs/>
+          <w:b/>
+        </w:rPr>
+        <w:t xml:space="preserve">unchanged</w:t>
+      </w:r>
+      <w:r>
+        <w:t xml:space="preserve">).</w:t>
+      </w:r>
+      <w:r>
+        <w:t xml:space="preserve"> </w:t>
+      </w:r>
+      <w:r>
+        <w:t xml:space="preserve">3. Authorize</w:t>
+      </w:r>
+      <w:r>
+        <w:t xml:space="preserve"> </w:t>
+      </w:r>
+      <w:r>
+        <w:rPr>
+          <w:bCs/>
+          <w:b/>
+        </w:rPr>
+        <w:t xml:space="preserve">DR consumer subscriptions</w:t>
+      </w:r>
+      <w:r>
+        <w:t xml:space="preserve"> </w:t>
+      </w:r>
+      <w:r>
+        <w:t xml:space="preserve">(production failover from the failed region).</w:t>
+      </w:r>
+      <w:r>
+        <w:t xml:space="preserve"> </w:t>
+      </w:r>
+      <w:r>
+        <w:t xml:space="preserve">4. Deploy prod-failover VMs against the</w:t>
+      </w:r>
+      <w:r>
+        <w:t xml:space="preserve"> </w:t>
+      </w:r>
+      <w:r>
+        <w:rPr>
+          <w:bCs/>
+          <w:b/>
+        </w:rPr>
+        <w:t xml:space="preserve">same</w:t>
+      </w:r>
+      <w:r>
+        <w:t xml:space="preserve"> </w:t>
+      </w:r>
+      <w:r>
+        <w:t xml:space="preserve">reservation (e.g., 80 of 100 units).</w:t>
+      </w:r>
+    </w:p>
+    <w:p>
+      <w:pPr>
+        <w:pStyle w:val="BodyText"/>
+      </w:pPr>
+      <w:r>
+        <w:rPr>
+          <w:bCs/>
+          <w:b/>
+        </w:rPr>
+        <w:t xml:space="preserve">Sizing &amp; accounting:</w:t>
+      </w:r>
+      <w:r>
+        <w:t xml:space="preserve"> </w:t>
+      </w:r>
+      <w:r>
+        <w:t xml:space="preserve">-</w:t>
+      </w:r>
+      <w:r>
+        <w:t xml:space="preserve"> </w:t>
+      </w:r>
+      <w:r>
+        <w:rPr>
+          <w:bCs/>
+          <w:b/>
+        </w:rPr>
+        <w:t xml:space="preserve">max-not-sum (DR-017):</w:t>
+      </w:r>
+      <w:r>
+        <w:t xml:space="preserve"> </w:t>
+      </w:r>
+      <w:r>
+        <w:t xml:space="preserve">because only one region fails at a time (</w:t>
+      </w:r>
+      <w:r>
+        <w:rPr>
+          <w:bCs/>
+          <w:b/>
+        </w:rPr>
+        <w:t xml:space="preserve">DR-001</w:t>
+      </w:r>
+      <w:r>
+        <w:t xml:space="preserve">), the pool is sized to absorb the</w:t>
+      </w:r>
+      <w:r>
+        <w:t xml:space="preserve"> </w:t>
+      </w:r>
+      <w:r>
+        <w:rPr>
+          <w:bCs/>
+          <w:b/>
+        </w:rPr>
+        <w:t xml:space="preserve">largest single source</w:t>
+      </w:r>
+      <w:r>
+        <w:t xml:space="preserve"> </w:t>
+      </w:r>
+      <w:r>
+        <w:t xml:space="preserve">it protects, not the sum → shared/overcommitted capacity.</w:t>
+      </w:r>
+      <w:r>
+        <w:t xml:space="preserve"> </w:t>
+      </w:r>
+      <w:r>
+        <w:t xml:space="preserve">-</w:t>
+      </w:r>
+      <w:r>
+        <w:t xml:space="preserve"> </w:t>
+      </w:r>
+      <w:r>
+        <w:rPr>
+          <w:bCs/>
+          <w:b/>
+        </w:rPr>
+        <w:t xml:space="preserve">FIN-008:</w:t>
+      </w:r>
+      <w:r>
+        <w:t xml:space="preserve"> </w:t>
+      </w:r>
+      <w:r>
+        <w:t xml:space="preserve">the shared/overcommit reservation is costed</w:t>
+      </w:r>
+      <w:r>
+        <w:t xml:space="preserve"> </w:t>
+      </w:r>
+      <w:r>
+        <w:rPr>
+          <w:bCs/>
+          <w:b/>
+        </w:rPr>
+        <w:t xml:space="preserve">once</w:t>
+      </w:r>
+      <w:r>
+        <w:t xml:space="preserve">, not per-source; steady-state CVAL cost and DR overcommit are the</w:t>
+      </w:r>
+      <w:r>
+        <w:t xml:space="preserve"> </w:t>
+      </w:r>
+      <w:r>
+        <w:rPr>
+          <w:iCs/>
+          <w:i/>
+        </w:rPr>
+        <w:t xml:space="preserve">same single cost</w:t>
+      </w:r>
+      <w:r>
+        <w:t xml:space="preserve">.</w:t>
+      </w:r>
+      <w:r>
+        <w:t xml:space="preserve"> </w:t>
+      </w:r>
+      <w:r>
+        <w:t xml:space="preserve">-</w:t>
+      </w:r>
+      <w:r>
+        <w:t xml:space="preserve"> </w:t>
+      </w:r>
+      <w:r>
+        <w:rPr>
+          <w:bCs/>
+          <w:b/>
+        </w:rPr>
+        <w:t xml:space="preserve">HC-6/HC-7:</w:t>
+      </w:r>
+      <w:r>
+        <w:t xml:space="preserve"> </w:t>
+      </w:r>
+      <w:r>
+        <w:t xml:space="preserve">co-located CVAL must not be double-counted as both live CVAL and available DR headroom.</w:t>
+      </w:r>
+      <w:r>
+        <w:t xml:space="preserve"> </w:t>
+      </w:r>
+      <w:r>
+        <w:t xml:space="preserve">-</w:t>
+      </w:r>
+      <w:r>
+        <w:t xml:space="preserve"> </w:t>
+      </w:r>
+      <w:r>
+        <w:rPr>
+          <w:bCs/>
+          <w:b/>
+        </w:rPr>
+        <w:t xml:space="preserve">Reversible on failback (DR-013):</w:t>
+      </w:r>
+      <w:r>
+        <w:t xml:space="preserve"> </w:t>
+      </w:r>
+      <w:r>
+        <w:t xml:space="preserve">DR consumers released, CVAL resumes consumption of the pool.</w:t>
+      </w:r>
+    </w:p>
+    <w:p>
+      <w:pPr>
+        <w:pStyle w:val="BlockText"/>
+      </w:pPr>
+      <w:r>
+        <w:rPr>
+          <w:bCs/>
+          <w:b/>
+        </w:rPr>
+        <w:t xml:space="preserve">ENV-003 is not violated during DR.</w:t>
+      </w:r>
+      <w:r>
+        <w:t xml:space="preserve"> </w:t>
+      </w:r>
+      <w:r>
+        <w:t xml:space="preserve">The CVAL/DR pool lives in the</w:t>
+      </w:r>
+      <w:r>
+        <w:t xml:space="preserve"> </w:t>
+      </w:r>
+      <w:r>
+        <w:rPr>
+          <w:bCs/>
+          <w:b/>
+        </w:rPr>
+        <w:t xml:space="preserve">standby</w:t>
+      </w:r>
+      <w:r>
+        <w:t xml:space="preserve"> </w:t>
+      </w:r>
+      <w:r>
+        <w:t xml:space="preserve">region and is classified non-prod/DR. Production failover into that region’s DR capacity is the pool’s intended purpose. It never co-mingles with that region’s</w:t>
+      </w:r>
+      <w:r>
+        <w:t xml:space="preserve"> </w:t>
+      </w:r>
+      <w:r>
+        <w:rPr>
+          <w:iCs/>
+          <w:i/>
+        </w:rPr>
+        <w:t xml:space="preserve">own</w:t>
+      </w:r>
+      <w:r>
+        <w:t xml:space="preserve"> </w:t>
+      </w:r>
+      <w:r>
+        <w:t xml:space="preserve">isolated Production grouping — the two groupings remain separate CRGs.</w:t>
       </w:r>
     </w:p>
     <w:p>
@@ -5104,9 +5953,10 @@
         </w:pict>
       </w:r>
     </w:p>
-    <w:bookmarkEnd w:id="39"/>
     <w:bookmarkEnd w:id="40"/>
-    <w:bookmarkStart w:id="44" w:name="reconciliation-lifecycle"/>
+    <w:bookmarkEnd w:id="41"/>
+    <w:bookmarkEnd w:id="42"/>
+    <w:bookmarkStart w:id="46" w:name="reconciliation-lifecycle"/>
     <w:p>
       <w:pPr>
         <w:pStyle w:val="Heading2"/>
@@ -5115,7 +5965,7 @@
         <w:t xml:space="preserve">6. Reconciliation &amp; Lifecycle</w:t>
       </w:r>
     </w:p>
-    <w:bookmarkStart w:id="41" w:name="target-formula-cap-003"/>
+    <w:bookmarkStart w:id="43" w:name="target-formula-cap-003"/>
     <w:p>
       <w:pPr>
         <w:pStyle w:val="Heading3"/>
@@ -5217,8 +6067,8 @@
         <w:t xml:space="preserve">= configurable per environment (C-2: production buffer, DR buffer)</w:t>
       </w:r>
     </w:p>
-    <w:bookmarkEnd w:id="41"/>
-    <w:bookmarkStart w:id="42" w:name="reconciliation-loop-cap-005-cap-006"/>
+    <w:bookmarkEnd w:id="43"/>
+    <w:bookmarkStart w:id="44" w:name="reconciliation-loop-cap-005-cap-006"/>
     <w:p>
       <w:pPr>
         <w:pStyle w:val="Heading3"/>
@@ -5412,8 +6262,8 @@
         <w:t xml:space="preserve">(CAP-010): approval + impact analysis + audit</w:t>
       </w:r>
     </w:p>
-    <w:bookmarkEnd w:id="42"/>
-    <w:bookmarkStart w:id="43" w:name="reactive-discovery-cap-024"/>
+    <w:bookmarkEnd w:id="44"/>
+    <w:bookmarkStart w:id="45" w:name="reactive-discovery-cap-024"/>
     <w:p>
       <w:pPr>
         <w:pStyle w:val="Heading3"/>
@@ -5494,9 +6344,9 @@
         </w:pict>
       </w:r>
     </w:p>
-    <w:bookmarkEnd w:id="43"/>
-    <w:bookmarkEnd w:id="44"/>
-    <w:bookmarkStart w:id="48" w:name="quick-reference-tables"/>
+    <w:bookmarkEnd w:id="45"/>
+    <w:bookmarkEnd w:id="46"/>
+    <w:bookmarkStart w:id="50" w:name="quick-reference-tables"/>
     <w:p>
       <w:pPr>
         <w:pStyle w:val="Heading2"/>
@@ -5505,7 +6355,7 @@
         <w:t xml:space="preserve">7. Quick Reference Tables</w:t>
       </w:r>
     </w:p>
-    <w:bookmarkStart w:id="45" w:name="crg-count-per-geography"/>
+    <w:bookmarkStart w:id="47" w:name="crg-count-per-geography"/>
     <w:p>
       <w:pPr>
         <w:pStyle w:val="Heading3"/>
@@ -6087,8 +6937,8 @@
         <w:t xml:space="preserve">4 CRGs per environment assumes 3 availability zones per region (1 regional + 3 per-AZ). Adjust for regions with different zone counts.</w:t>
       </w:r>
     </w:p>
-    <w:bookmarkEnd w:id="45"/>
-    <w:bookmarkStart w:id="46" w:name="environment-separation-matrix-env-003"/>
+    <w:bookmarkEnd w:id="47"/>
+    <w:bookmarkStart w:id="48" w:name="environment-separation-matrix-env-003"/>
     <w:p>
       <w:pPr>
         <w:pStyle w:val="Heading3"/>
@@ -6321,8 +7171,8 @@
         </w:tc>
       </w:tr>
     </w:tbl>
-    <w:bookmarkEnd w:id="46"/>
-    <w:bookmarkStart w:id="47" w:name="naming-pattern-quick-reference"/>
+    <w:bookmarkEnd w:id="48"/>
+    <w:bookmarkStart w:id="49" w:name="naming-pattern-quick-reference"/>
     <w:p>
       <w:pPr>
         <w:pStyle w:val="Heading3"/>
@@ -6504,9 +7354,9 @@
         </w:pict>
       </w:r>
     </w:p>
-    <w:bookmarkEnd w:id="47"/>
-    <w:bookmarkEnd w:id="48"/>
-    <w:bookmarkStart w:id="49" w:name="related-documents"/>
+    <w:bookmarkEnd w:id="49"/>
+    <w:bookmarkEnd w:id="50"/>
+    <w:bookmarkStart w:id="51" w:name="related-documents"/>
     <w:p>
       <w:pPr>
         <w:pStyle w:val="Heading2"/>
@@ -6669,8 +7519,8 @@
         </w:pict>
       </w:r>
     </w:p>
-    <w:bookmarkEnd w:id="49"/>
-    <w:bookmarkStart w:id="50" w:name="revision-history"/>
+    <w:bookmarkEnd w:id="51"/>
+    <w:bookmarkStart w:id="52" w:name="revision-history"/>
     <w:p>
       <w:pPr>
         <w:pStyle w:val="Heading2"/>
@@ -6789,8 +7639,8 @@
         <w:t xml:space="preserve">End of document.</w:t>
       </w:r>
     </w:p>
-    <w:bookmarkEnd w:id="50"/>
-    <w:bookmarkEnd w:id="51"/>
+    <w:bookmarkEnd w:id="52"/>
+    <w:bookmarkEnd w:id="53"/>
     <w:sectPr/>
   </w:body>
 </w:document>

</xml_diff>